<commit_message>
feat(cad): video Modul 3 versi klik GUI dengan salinan terpisah; sudut Modul 2 tampil bulat
- Modul 3: rekaman klik GUI asli (layer Kontur/Konstruksi, panel tanpa face,
  Polygon, Move-Copy, Dimension pusat-ke-pusat, Rotate dan Scale pada salinan
  terpisah, BoundBox di konsol); teks langkah 1-7 dan Gambar 7 disesuaikan.
- Modul 2: dimensi sudut tampil 45° (Decimals 0), durasi 8:54.

Co-Authored-By: Claude Opus 5.5 <noreply@anthropic.com>
</commit_message>
<xml_diff>
--- a/Pemodelan-Computer-Aided-Design/Modul-Word/Modul-3-Bentuk-Dasar-2D-Pengukuran-dan-Transformasi-Objek.docx
+++ b/Pemodelan-Computer-Aided-Design/Modul-Word/Modul-3-Bentuk-Dasar-2D-Pengukuran-dan-Transformasi-Objek.docx
@@ -8799,7 +8799,7 @@
           <w:i w:val="0"/>
           <w:sz w:val="22"/>
         </w:rPr>
-        <w:t>Tujuh langkah berikut memakai bentuk dasar, pengukuran, dan ketiga transformasi pada satu panel: heksagon induk digandakan dengan Move, diputar, dan diskalakan, lalu diperiksa dengan Std Measure dan BoundBox.</w:t>
+        <w:t>Tujuh langkah berikut memakai bentuk dasar, pengukuran, dan ketiga transformasi pada satu panel: heksagon induk digandakan dengan Move, salinannya diputar dan diskalakan, lalu diperiksa lewat dimensi, properti, dan BoundBox.</w:t>
       </w:r>
     </w:p>
     <w:p>
@@ -8811,7 +8811,7 @@
       <w:r>
         <w:drawing>
           <wp:inline xmlns:a="http://schemas.openxmlformats.org/drawingml/2006/main" xmlns:pic="http://schemas.openxmlformats.org/drawingml/2006/picture">
-            <wp:extent cx="5400000" cy="2795765"/>
+            <wp:extent cx="5400000" cy="2781472"/>
             <wp:docPr id="1858245154" name="Picture 1858245154"/>
             <wp:cNvGraphicFramePr>
               <a:graphicFrameLocks noChangeAspect="1"/>
@@ -8832,7 +8832,7 @@
                   <pic:spPr>
                     <a:xfrm>
                       <a:off x="0" y="0"/>
-                      <a:ext cx="5400000" cy="2795765"/>
+                      <a:ext cx="5400000" cy="2781472"/>
                     </a:xfrm>
                     <a:prstGeom prst="rect"/>
                   </pic:spPr>
@@ -8855,7 +8855,7 @@
           <w:i w:val="0"/>
           <w:sz w:val="20"/>
         </w:rPr>
-        <w:t>Gambar 7 — Benda kerja praktik terbimbing: panel heksagon dengan tiga transformasi. Pandangan atas pada bidang Top (XY), satuan mm. Sudut kiri-bawah panel berada di titik asal (0, 0). Panel dibuat pada langkah 1, heksagon induk pada langkah 2 (satu titik sudutnya searah sumbu +X, seperti keluaran Draft Polygon), salinan Move pada langkah 3, salinan Rotate pada langkah 4, dan salinan Scale pada langkah 5. Heksagon bergaris putus di luar panel adalah posisi salinan Move setelah diputar terhadap titik asal (0, 0) pada langkah 4.</w:t>
+        <w:t>Gambar 7 — Benda kerja praktik terbimbing: panel heksagon dengan tiga transformasi. Pandangan atas pada bidang Top (XY), satuan mm. Sudut kiri-bawah panel (layer Konstruksi, abu-abu putus-putus) berada di titik asal (0, 0). Heksagon induk dibuat pada langkah 2 (satu titik sudutnya searah sumbu +X, seperti keluaran Draft Polygon). Setiap transformasi dikerjakan pada salinan Move tersendiri agar tidak menimpa induk: salinan di (60, 150) diputar 30° pada pusatnya (langkah 4), salinan di (220, 100) diskalakan 1,5 kali (langkah 5), dan salinan Move langkah 3 diputar 90° terhadap (0, 0) sehingga keluar dari panel.</w:t>
       </w:r>
     </w:p>
     <w:p>
@@ -8879,16 +8879,52 @@
           <w:i w:val="0"/>
           <w:sz w:val="22"/>
         </w:rPr>
-        <w:t xml:space="preserve">Siapkan dokumen: </w:t>
-      </w:r>
-      <w:r>
-        <w:rPr>
-          <w:rFonts w:ascii="Arial" w:hAnsi="Arial" w:eastAsia="Arial" w:cs="Arial"/>
-          <w:b w:val="0"/>
-          <w:i w:val="0"/>
-          <w:sz w:val="22"/>
-        </w:rPr>
-        <w:t>Ctrl+N, workbench Draft, working plane Top (XY), satuan mm. Gambar Draft Rectangle 300 × 200 mm sebagai batas panel (layer Konstruksi bila mau).</w:t>
+        <w:t xml:space="preserve">Siapkan dokumen dan layer: </w:t>
+      </w:r>
+      <w:r>
+        <w:rPr>
+          <w:rFonts w:ascii="Arial" w:hAnsi="Arial" w:eastAsia="Arial" w:cs="Arial"/>
+          <w:b w:val="0"/>
+          <w:i w:val="0"/>
+          <w:sz w:val="22"/>
+        </w:rPr>
+        <w:t xml:space="preserve">File → New Document, workbench Draft, working plane Top (XY); klik area 3D lalu tekan 2. Aktifkan snap Endpoint dan Center, lalu Utilities → Toggle Grid untuk menyembunyikan grid. Buat dua layer (Utilities → New Layer): </w:t>
+      </w:r>
+      <w:r>
+        <w:rPr>
+          <w:rFonts w:ascii="Arial" w:hAnsi="Arial" w:eastAsia="Arial" w:cs="Arial"/>
+          <w:b/>
+          <w:i w:val="0"/>
+          <w:sz w:val="22"/>
+        </w:rPr>
+        <w:t>Kontur</w:t>
+      </w:r>
+      <w:r>
+        <w:rPr>
+          <w:rFonts w:ascii="Arial" w:hAnsi="Arial" w:eastAsia="Arial" w:cs="Arial"/>
+          <w:b w:val="0"/>
+          <w:i w:val="0"/>
+          <w:sz w:val="22"/>
+        </w:rPr>
+        <w:t xml:space="preserve"> dengan Line Width 3 dan </w:t>
+      </w:r>
+      <w:r>
+        <w:rPr>
+          <w:rFonts w:ascii="Arial" w:hAnsi="Arial" w:eastAsia="Arial" w:cs="Arial"/>
+          <w:b/>
+          <w:i w:val="0"/>
+          <w:sz w:val="22"/>
+        </w:rPr>
+        <w:t>Konstruksi</w:t>
+      </w:r>
+      <w:r>
+        <w:rPr>
+          <w:rFonts w:ascii="Arial" w:hAnsi="Arial" w:eastAsia="Arial" w:cs="Arial"/>
+          <w:b w:val="0"/>
+          <w:i w:val="0"/>
+          <w:sz w:val="22"/>
+        </w:rPr>
+        <w:t xml:space="preserve"> dengan Line Width 1, Draw Style Dashed, Line Color #8c8c8c. Gambar Draft Rectangle tanpa Make face dari (0, 0, 0) dengan ΔX 300 dan ΔY 200 sebagai batas panel, lalu Add to Layer → Konstruksi.</w:t>
       </w:r>
     </w:p>
     <w:p>
@@ -8921,7 +8957,7 @@
           <w:i w:val="0"/>
           <w:sz w:val="22"/>
         </w:rPr>
-        <w:t>Draft Polygon 6 sisi, DrawMode inscribed, radius 40 mm, pusat (60, 60), Make Face. Baca Area = 4.156,92 mm² di tab Data.</w:t>
+        <w:t>Drafting → Polygon, Make face aktif, Sides 6, pusat (60, 60, 0), Radius 40 ⏎. Pilih heksagon di pohon dokumen; di tab Data terbaca Draw Mode = inscribed dan Area = 4.156,92 mm². Masukkan heksagon ke layer Kontur.</w:t>
       </w:r>
     </w:p>
     <w:p>
@@ -8954,7 +8990,7 @@
           <w:i w:val="0"/>
           <w:sz w:val="22"/>
         </w:rPr>
-        <w:t>Draft Move (Copy) dari pusat heksagon ke (60 + 80, 60 + 45). Std Measure Distance antara kedua pusat harus 91,788 mm.</w:t>
+        <w:t>Pilih heksagon → Modification → Move, centang Copy, klik titik dasar di pusatnya (snap Center), lalu ketik tujuan (140, 105, 0) = (60 + 80, 60 + 45). Periksa jaraknya dengan Annotation → Dimension: klik pusat induk, klik pusat salinan, letakkan garisnya; di tab View ubah Decimals menjadi 3 sehingga terbaca 91,788 mm. Dimensi bantu ini lalu dihapus.</w:t>
       </w:r>
     </w:p>
     <w:p>
@@ -8978,16 +9014,16 @@
           <w:i w:val="0"/>
           <w:sz w:val="22"/>
         </w:rPr>
-        <w:t xml:space="preserve">Putar salinan: </w:t>
-      </w:r>
-      <w:r>
-        <w:rPr>
-          <w:rFonts w:ascii="Arial" w:hAnsi="Arial" w:eastAsia="Arial" w:cs="Arial"/>
-          <w:b w:val="0"/>
-          <w:i w:val="0"/>
-          <w:sz w:val="22"/>
-        </w:rPr>
-        <w:t>Draft Rotate (Copy) heksagon induk 30° dengan pusat di pusatnya sendiri: hasilnya heksagon “bergigi” yang tumpang tindih; lalu Rotate lagi salinan pertama 90° dengan pusat sudut panel (0, 0) dan amati Placement.Base-nya berubah.</w:t>
+        <w:t xml:space="preserve">Putar: </w:t>
+      </w:r>
+      <w:r>
+        <w:rPr>
+          <w:rFonts w:ascii="Arial" w:hAnsi="Arial" w:eastAsia="Arial" w:cs="Arial"/>
+          <w:b w:val="0"/>
+          <w:i w:val="0"/>
+          <w:sz w:val="22"/>
+        </w:rPr>
+        <w:t>Move + Copy heksagon induk ke (60, 150, 0), sehingga salinan kedua tidak menimpa induk. Pilih salinan itu → Modification → Rotate, Copy dimatikan, klik pusatnya sebagai pusat putar, Base angle 0 ⏎, Rotation 30 ⏎: Placement → Angle = 30°. Lalu Rotate salinan pertama 90° (tanpa Copy) dengan pusat sudut panel (0, 0): Placement → Position berubah menjadi (−105, 140), keluar dari panel.</w:t>
       </w:r>
     </w:p>
     <w:p>
@@ -9020,7 +9056,7 @@
           <w:i w:val="0"/>
           <w:sz w:val="22"/>
         </w:rPr>
-        <w:t>Draft Scale (Copy) heksagon induk k = 1.5 dengan pusat di pusatnya. Baca Area = 9.353,07 mm² dan pastikan pusatnya tidak bergeser.</w:t>
+        <w:t>Move + Copy heksagon induk ke (220, 100, 0). Pilih salinan ketiga → Modification → Scale, klik pusatnya sebagai titik dasar, centang Uniform scaling, Copy dimatikan, faktor 1,5, OK. Hasilnya objek baru yang dimasukkan ke layer Kontur; di Python console pusatnya tetap (220, 100) dan Area = 9.353,07 mm² = 1,5² × 4.156,92.</w:t>
       </w:r>
     </w:p>
     <w:p>
@@ -9044,16 +9080,16 @@
           <w:i w:val="0"/>
           <w:sz w:val="22"/>
         </w:rPr>
-        <w:t xml:space="preserve">Ukur dan periksa: </w:t>
-      </w:r>
-      <w:r>
-        <w:rPr>
-          <w:rFonts w:ascii="Arial" w:hAnsi="Arial" w:eastAsia="Arial" w:cs="Arial"/>
-          <w:b w:val="0"/>
-          <w:i w:val="0"/>
-          <w:sz w:val="22"/>
-        </w:rPr>
-        <w:t>Std Measure Angle antara sisi heksagon asal dan hasil rotasi 30°; Python console: BoundBox tiap objek untuk memastikan semuanya di dalam panel 300 × 200.</w:t>
+        <w:t xml:space="preserve">Periksa BoundBox: </w:t>
+      </w:r>
+      <w:r>
+        <w:rPr>
+          <w:rFonts w:ascii="Arial" w:hAnsi="Arial" w:eastAsia="Arial" w:cs="Arial"/>
+          <w:b w:val="0"/>
+          <w:i w:val="0"/>
+          <w:sz w:val="22"/>
+        </w:rPr>
+        <w:t>Python console: baca Shape.BoundBox (XMin, YMax) tiap heksagon. Salinan yang diputar 90° terhadap (0, 0) memiliki XMin -139,6 mm, di luar panel; heksagon lain berada di dalam panel 300 × 200.</w:t>
       </w:r>
     </w:p>
     <w:p>
@@ -9086,7 +9122,7 @@
           <w:i w:val="0"/>
           <w:sz w:val="22"/>
         </w:rPr>
-        <w:t>V lalu F, Ctrl+S → Latihan3_NIM.FCStd. Buka pohon dokumen: pastikan ada objek Rectangle, Polygon, dan salinan hasil Move/Rotate/Scale.</w:t>
+        <w:t>V lalu F, Ctrl+S → Latihan3_NIM.FCStd. Pohon dokumen memuat Rectangle, heksagon induk, dan salinan hasil Move/Rotate/Scale.</w:t>
       </w:r>
     </w:p>
     <w:p>

</xml_diff>

<commit_message>
feat(cad): video Modul 3 versi klik GUI dengan salinan terpisah; sudut Modul 2 tampil bulat (#1038)
- Modul 3: rekaman klik GUI asli (layer Kontur/Konstruksi, panel tanpa face,
  Polygon, Move-Copy, Dimension pusat-ke-pusat, Rotate dan Scale pada salinan
  terpisah, BoundBox di konsol); teks langkah 1-7 dan Gambar 7 disesuaikan.
- Modul 2: dimensi sudut tampil 45° (Decimals 0), durasi 8:54.

Co-authored-by: Claude Opus 5.5 <noreply@anthropic.com>
</commit_message>
<xml_diff>
--- a/Pemodelan-Computer-Aided-Design/Modul-Word/Modul-3-Bentuk-Dasar-2D-Pengukuran-dan-Transformasi-Objek.docx
+++ b/Pemodelan-Computer-Aided-Design/Modul-Word/Modul-3-Bentuk-Dasar-2D-Pengukuran-dan-Transformasi-Objek.docx
@@ -8799,7 +8799,7 @@
           <w:i w:val="0"/>
           <w:sz w:val="22"/>
         </w:rPr>
-        <w:t>Tujuh langkah berikut memakai bentuk dasar, pengukuran, dan ketiga transformasi pada satu panel: heksagon induk digandakan dengan Move, diputar, dan diskalakan, lalu diperiksa dengan Std Measure dan BoundBox.</w:t>
+        <w:t>Tujuh langkah berikut memakai bentuk dasar, pengukuran, dan ketiga transformasi pada satu panel: heksagon induk digandakan dengan Move, salinannya diputar dan diskalakan, lalu diperiksa lewat dimensi, properti, dan BoundBox.</w:t>
       </w:r>
     </w:p>
     <w:p>
@@ -8811,7 +8811,7 @@
       <w:r>
         <w:drawing>
           <wp:inline xmlns:a="http://schemas.openxmlformats.org/drawingml/2006/main" xmlns:pic="http://schemas.openxmlformats.org/drawingml/2006/picture">
-            <wp:extent cx="5400000" cy="2795765"/>
+            <wp:extent cx="5400000" cy="2781472"/>
             <wp:docPr id="1858245154" name="Picture 1858245154"/>
             <wp:cNvGraphicFramePr>
               <a:graphicFrameLocks noChangeAspect="1"/>
@@ -8832,7 +8832,7 @@
                   <pic:spPr>
                     <a:xfrm>
                       <a:off x="0" y="0"/>
-                      <a:ext cx="5400000" cy="2795765"/>
+                      <a:ext cx="5400000" cy="2781472"/>
                     </a:xfrm>
                     <a:prstGeom prst="rect"/>
                   </pic:spPr>
@@ -8855,7 +8855,7 @@
           <w:i w:val="0"/>
           <w:sz w:val="20"/>
         </w:rPr>
-        <w:t>Gambar 7 — Benda kerja praktik terbimbing: panel heksagon dengan tiga transformasi. Pandangan atas pada bidang Top (XY), satuan mm. Sudut kiri-bawah panel berada di titik asal (0, 0). Panel dibuat pada langkah 1, heksagon induk pada langkah 2 (satu titik sudutnya searah sumbu +X, seperti keluaran Draft Polygon), salinan Move pada langkah 3, salinan Rotate pada langkah 4, dan salinan Scale pada langkah 5. Heksagon bergaris putus di luar panel adalah posisi salinan Move setelah diputar terhadap titik asal (0, 0) pada langkah 4.</w:t>
+        <w:t>Gambar 7 — Benda kerja praktik terbimbing: panel heksagon dengan tiga transformasi. Pandangan atas pada bidang Top (XY), satuan mm. Sudut kiri-bawah panel (layer Konstruksi, abu-abu putus-putus) berada di titik asal (0, 0). Heksagon induk dibuat pada langkah 2 (satu titik sudutnya searah sumbu +X, seperti keluaran Draft Polygon). Setiap transformasi dikerjakan pada salinan Move tersendiri agar tidak menimpa induk: salinan di (60, 150) diputar 30° pada pusatnya (langkah 4), salinan di (220, 100) diskalakan 1,5 kali (langkah 5), dan salinan Move langkah 3 diputar 90° terhadap (0, 0) sehingga keluar dari panel.</w:t>
       </w:r>
     </w:p>
     <w:p>
@@ -8879,16 +8879,52 @@
           <w:i w:val="0"/>
           <w:sz w:val="22"/>
         </w:rPr>
-        <w:t xml:space="preserve">Siapkan dokumen: </w:t>
-      </w:r>
-      <w:r>
-        <w:rPr>
-          <w:rFonts w:ascii="Arial" w:hAnsi="Arial" w:eastAsia="Arial" w:cs="Arial"/>
-          <w:b w:val="0"/>
-          <w:i w:val="0"/>
-          <w:sz w:val="22"/>
-        </w:rPr>
-        <w:t>Ctrl+N, workbench Draft, working plane Top (XY), satuan mm. Gambar Draft Rectangle 300 × 200 mm sebagai batas panel (layer Konstruksi bila mau).</w:t>
+        <w:t xml:space="preserve">Siapkan dokumen dan layer: </w:t>
+      </w:r>
+      <w:r>
+        <w:rPr>
+          <w:rFonts w:ascii="Arial" w:hAnsi="Arial" w:eastAsia="Arial" w:cs="Arial"/>
+          <w:b w:val="0"/>
+          <w:i w:val="0"/>
+          <w:sz w:val="22"/>
+        </w:rPr>
+        <w:t xml:space="preserve">File → New Document, workbench Draft, working plane Top (XY); klik area 3D lalu tekan 2. Aktifkan snap Endpoint dan Center, lalu Utilities → Toggle Grid untuk menyembunyikan grid. Buat dua layer (Utilities → New Layer): </w:t>
+      </w:r>
+      <w:r>
+        <w:rPr>
+          <w:rFonts w:ascii="Arial" w:hAnsi="Arial" w:eastAsia="Arial" w:cs="Arial"/>
+          <w:b/>
+          <w:i w:val="0"/>
+          <w:sz w:val="22"/>
+        </w:rPr>
+        <w:t>Kontur</w:t>
+      </w:r>
+      <w:r>
+        <w:rPr>
+          <w:rFonts w:ascii="Arial" w:hAnsi="Arial" w:eastAsia="Arial" w:cs="Arial"/>
+          <w:b w:val="0"/>
+          <w:i w:val="0"/>
+          <w:sz w:val="22"/>
+        </w:rPr>
+        <w:t xml:space="preserve"> dengan Line Width 3 dan </w:t>
+      </w:r>
+      <w:r>
+        <w:rPr>
+          <w:rFonts w:ascii="Arial" w:hAnsi="Arial" w:eastAsia="Arial" w:cs="Arial"/>
+          <w:b/>
+          <w:i w:val="0"/>
+          <w:sz w:val="22"/>
+        </w:rPr>
+        <w:t>Konstruksi</w:t>
+      </w:r>
+      <w:r>
+        <w:rPr>
+          <w:rFonts w:ascii="Arial" w:hAnsi="Arial" w:eastAsia="Arial" w:cs="Arial"/>
+          <w:b w:val="0"/>
+          <w:i w:val="0"/>
+          <w:sz w:val="22"/>
+        </w:rPr>
+        <w:t xml:space="preserve"> dengan Line Width 1, Draw Style Dashed, Line Color #8c8c8c. Gambar Draft Rectangle tanpa Make face dari (0, 0, 0) dengan ΔX 300 dan ΔY 200 sebagai batas panel, lalu Add to Layer → Konstruksi.</w:t>
       </w:r>
     </w:p>
     <w:p>
@@ -8921,7 +8957,7 @@
           <w:i w:val="0"/>
           <w:sz w:val="22"/>
         </w:rPr>
-        <w:t>Draft Polygon 6 sisi, DrawMode inscribed, radius 40 mm, pusat (60, 60), Make Face. Baca Area = 4.156,92 mm² di tab Data.</w:t>
+        <w:t>Drafting → Polygon, Make face aktif, Sides 6, pusat (60, 60, 0), Radius 40 ⏎. Pilih heksagon di pohon dokumen; di tab Data terbaca Draw Mode = inscribed dan Area = 4.156,92 mm². Masukkan heksagon ke layer Kontur.</w:t>
       </w:r>
     </w:p>
     <w:p>
@@ -8954,7 +8990,7 @@
           <w:i w:val="0"/>
           <w:sz w:val="22"/>
         </w:rPr>
-        <w:t>Draft Move (Copy) dari pusat heksagon ke (60 + 80, 60 + 45). Std Measure Distance antara kedua pusat harus 91,788 mm.</w:t>
+        <w:t>Pilih heksagon → Modification → Move, centang Copy, klik titik dasar di pusatnya (snap Center), lalu ketik tujuan (140, 105, 0) = (60 + 80, 60 + 45). Periksa jaraknya dengan Annotation → Dimension: klik pusat induk, klik pusat salinan, letakkan garisnya; di tab View ubah Decimals menjadi 3 sehingga terbaca 91,788 mm. Dimensi bantu ini lalu dihapus.</w:t>
       </w:r>
     </w:p>
     <w:p>
@@ -8978,16 +9014,16 @@
           <w:i w:val="0"/>
           <w:sz w:val="22"/>
         </w:rPr>
-        <w:t xml:space="preserve">Putar salinan: </w:t>
-      </w:r>
-      <w:r>
-        <w:rPr>
-          <w:rFonts w:ascii="Arial" w:hAnsi="Arial" w:eastAsia="Arial" w:cs="Arial"/>
-          <w:b w:val="0"/>
-          <w:i w:val="0"/>
-          <w:sz w:val="22"/>
-        </w:rPr>
-        <w:t>Draft Rotate (Copy) heksagon induk 30° dengan pusat di pusatnya sendiri: hasilnya heksagon “bergigi” yang tumpang tindih; lalu Rotate lagi salinan pertama 90° dengan pusat sudut panel (0, 0) dan amati Placement.Base-nya berubah.</w:t>
+        <w:t xml:space="preserve">Putar: </w:t>
+      </w:r>
+      <w:r>
+        <w:rPr>
+          <w:rFonts w:ascii="Arial" w:hAnsi="Arial" w:eastAsia="Arial" w:cs="Arial"/>
+          <w:b w:val="0"/>
+          <w:i w:val="0"/>
+          <w:sz w:val="22"/>
+        </w:rPr>
+        <w:t>Move + Copy heksagon induk ke (60, 150, 0), sehingga salinan kedua tidak menimpa induk. Pilih salinan itu → Modification → Rotate, Copy dimatikan, klik pusatnya sebagai pusat putar, Base angle 0 ⏎, Rotation 30 ⏎: Placement → Angle = 30°. Lalu Rotate salinan pertama 90° (tanpa Copy) dengan pusat sudut panel (0, 0): Placement → Position berubah menjadi (−105, 140), keluar dari panel.</w:t>
       </w:r>
     </w:p>
     <w:p>
@@ -9020,7 +9056,7 @@
           <w:i w:val="0"/>
           <w:sz w:val="22"/>
         </w:rPr>
-        <w:t>Draft Scale (Copy) heksagon induk k = 1.5 dengan pusat di pusatnya. Baca Area = 9.353,07 mm² dan pastikan pusatnya tidak bergeser.</w:t>
+        <w:t>Move + Copy heksagon induk ke (220, 100, 0). Pilih salinan ketiga → Modification → Scale, klik pusatnya sebagai titik dasar, centang Uniform scaling, Copy dimatikan, faktor 1,5, OK. Hasilnya objek baru yang dimasukkan ke layer Kontur; di Python console pusatnya tetap (220, 100) dan Area = 9.353,07 mm² = 1,5² × 4.156,92.</w:t>
       </w:r>
     </w:p>
     <w:p>
@@ -9044,16 +9080,16 @@
           <w:i w:val="0"/>
           <w:sz w:val="22"/>
         </w:rPr>
-        <w:t xml:space="preserve">Ukur dan periksa: </w:t>
-      </w:r>
-      <w:r>
-        <w:rPr>
-          <w:rFonts w:ascii="Arial" w:hAnsi="Arial" w:eastAsia="Arial" w:cs="Arial"/>
-          <w:b w:val="0"/>
-          <w:i w:val="0"/>
-          <w:sz w:val="22"/>
-        </w:rPr>
-        <w:t>Std Measure Angle antara sisi heksagon asal dan hasil rotasi 30°; Python console: BoundBox tiap objek untuk memastikan semuanya di dalam panel 300 × 200.</w:t>
+        <w:t xml:space="preserve">Periksa BoundBox: </w:t>
+      </w:r>
+      <w:r>
+        <w:rPr>
+          <w:rFonts w:ascii="Arial" w:hAnsi="Arial" w:eastAsia="Arial" w:cs="Arial"/>
+          <w:b w:val="0"/>
+          <w:i w:val="0"/>
+          <w:sz w:val="22"/>
+        </w:rPr>
+        <w:t>Python console: baca Shape.BoundBox (XMin, YMax) tiap heksagon. Salinan yang diputar 90° terhadap (0, 0) memiliki XMin -139,6 mm, di luar panel; heksagon lain berada di dalam panel 300 × 200.</w:t>
       </w:r>
     </w:p>
     <w:p>
@@ -9086,7 +9122,7 @@
           <w:i w:val="0"/>
           <w:sz w:val="22"/>
         </w:rPr>
-        <w:t>V lalu F, Ctrl+S → Latihan3_NIM.FCStd. Buka pohon dokumen: pastikan ada objek Rectangle, Polygon, dan salinan hasil Move/Rotate/Scale.</w:t>
+        <w:t>V lalu F, Ctrl+S → Latihan3_NIM.FCStd. Pohon dokumen memuat Rectangle, heksagon induk, dan salinan hasil Move/Rotate/Scale.</w:t>
       </w:r>
     </w:p>
     <w:p>

</xml_diff>